<commit_message>
Alvará evento 30/10: inclui endereço do estádio e remove RG do requerente
Co-Authored-By: Claude Opus 5.5 <noreply@anthropic.com>
Claude-Session: https://claude.ai/code/session_01Xsu4psjqdzYnCKVsDP2B5y
</commit_message>
<xml_diff>
--- a/Alvará evento 30-10-2026 - Ronaldo de Lima Barbosa/Comunicação prévia à PM - evento 30-10-2026 - Ronaldo de Lima Barbosa.docx
+++ b/Alvará evento 30-10-2026 - Ronaldo de Lima Barbosa/Comunicação prévia à PM - evento 30-10-2026 - Ronaldo de Lima Barbosa.docx
@@ -73,18 +73,7 @@
         <w:t xml:space="preserve">RONALDO DE LIMA BARBOSA</w:t>
       </w:r>
       <w:r>
-        <w:t xml:space="preserve">, brasileiro, solteiro, Vereador do Município de Miguel Alves-PI, natural de Miguel Alves-PI, nascido em 06/05/1986, filho de Antonia Rodrigues Lima, inscrito no CPF sob o nº 027.258.423-10, </w:t>
-      </w:r>
-      <w:r>
-        <w:rPr>
-          <w:b/>
-          <w:bCs/>
-          <w:shd w:fill="FFF200" w:color="auto" w:val="clear"/>
-        </w:rPr>
-        <w:t xml:space="preserve">[RG nº ____ SSP/PI]</w:t>
-      </w:r>
-      <w:r>
-        <w:t xml:space="preserve">, residente e domiciliado na Rua Lateral, nº 2698, Bairro Forquilha, Miguel Alves-PI, CEP 64.130-000, por meio de seu advogado, </w:t>
+        <w:t xml:space="preserve">, brasileiro, solteiro, Vereador do Município de Miguel Alves-PI, natural de Miguel Alves-PI, nascido em 06/05/1986, filho de Antonia Rodrigues Lima, inscrito no CPF sob o nº 027.258.423-10, residente e domiciliado na Rua Lateral, nº 2698, Bairro Forquilha, Miguel Alves-PI, CEP 64.130-000, por meio de seu advogado, </w:t>
       </w:r>
       <w:r>
         <w:rPr>
@@ -173,18 +162,7 @@
         <w:t xml:space="preserve">Local:</w:t>
       </w:r>
       <w:r>
-        <w:t xml:space="preserve"> via pública em frente ao Estádio Municipal “O Torrão”, </w:t>
-      </w:r>
-      <w:r>
-        <w:rPr>
-          <w:b/>
-          <w:bCs/>
-          <w:shd w:fill="FFF200" w:color="auto" w:val="clear"/>
-        </w:rPr>
-        <w:t xml:space="preserve">[Rua/Avenida ____]</w:t>
-      </w:r>
-      <w:r>
-        <w:t xml:space="preserve">, Miguel Alves-PI, com palco, som e apresentação de banda;</w:t>
+        <w:t xml:space="preserve"> Avenida Marcos Furtado, em frente ao Estádio Municipal Enéas Torres Filho (“O Torrão”), Miguel Alves-PI (Plus Code R493+M8), com palco, som e apresentação de banda;</w:t>
       </w:r>
     </w:p>
     <w:p>
@@ -297,18 +275,7 @@
         <w:t xml:space="preserve">Interdição de via requerida ao Município:</w:t>
       </w:r>
       <w:r>
-        <w:t xml:space="preserve"> </w:t>
-      </w:r>
-      <w:r>
-        <w:rPr>
-          <w:b/>
-          <w:bCs/>
-          <w:shd w:fill="FFF200" w:color="auto" w:val="clear"/>
-        </w:rPr>
-        <w:t xml:space="preserve">[trecho]</w:t>
-      </w:r>
-      <w:r>
-        <w:t xml:space="preserve">, das </w:t>
+        <w:t xml:space="preserve"> Avenida Marcos Furtado, em frente ao estádio, das </w:t>
       </w:r>
       <w:r>
         <w:rPr>

</xml_diff>

<commit_message>
Alvará evento 30/10: adapta pedido à falta de croqui, laudo e estimativa de público
Co-Authored-By: Claude Opus 5.5 <noreply@anthropic.com>
Claude-Session: https://claude.ai/code/session_01Xsu4psjqdzYnCKVsDP2B5y
</commit_message>
<xml_diff>
--- a/Alvará evento 30-10-2026 - Ronaldo de Lima Barbosa/Comunicação prévia à PM - evento 30-10-2026 - Ronaldo de Lima Barbosa.docx
+++ b/Alvará evento 30-10-2026 - Ronaldo de Lima Barbosa/Comunicação prévia à PM - evento 30-10-2026 - Ronaldo de Lima Barbosa.docx
@@ -241,18 +241,7 @@
         <w:t xml:space="preserve">Público estimado:</w:t>
       </w:r>
       <w:r>
-        <w:t xml:space="preserve"> </w:t>
-      </w:r>
-      <w:r>
-        <w:rPr>
-          <w:b/>
-          <w:bCs/>
-          <w:shd w:fill="FFF200" w:color="auto" w:val="clear"/>
-        </w:rPr>
-        <w:t xml:space="preserve">[____]</w:t>
-      </w:r>
-      <w:r>
-        <w:t xml:space="preserve"> pessoas;</w:t>
+        <w:t xml:space="preserve"> não há estimativa precisa, por se tratar de celebração aberta e de adesão espontânea, podendo superar 250 pessoas;</w:t>
       </w:r>
     </w:p>
     <w:p>

</xml_diff>

<commit_message>
Alvará evento 30/10: carreata sem trajeto pré-definido
Co-Authored-By: Claude Opus 5.5 <noreply@anthropic.com>
Claude-Session: https://claude.ai/code/session_01Xsu4psjqdzYnCKVsDP2B5y
</commit_message>
<xml_diff>
--- a/Alvará evento 30-10-2026 - Ronaldo de Lima Barbosa/Comunicação prévia à PM - evento 30-10-2026 - Ronaldo de Lima Barbosa.docx
+++ b/Alvará evento 30-10-2026 - Ronaldo de Lima Barbosa/Comunicação prévia à PM - evento 30-10-2026 - Ronaldo de Lima Barbosa.docx
@@ -207,18 +207,7 @@
         <w:t xml:space="preserve">[local]</w:t>
       </w:r>
       <w:r>
-        <w:t xml:space="preserve">, percurso </w:t>
-      </w:r>
-      <w:r>
-        <w:rPr>
-          <w:b/>
-          <w:bCs/>
-          <w:shd w:fill="FFF200" w:color="auto" w:val="clear"/>
-        </w:rPr>
-        <w:t xml:space="preserve">[____]</w:t>
-      </w:r>
-      <w:r>
-        <w:t xml:space="preserve">, encerramento no local do evento;</w:t>
+        <w:t xml:space="preserve">, percurso pelas vias públicas da cidade, a ser ajustado com esta Corporação, se necessário, e encerramento no local do evento;</w:t>
       </w:r>
     </w:p>
     <w:p>

</xml_diff>

<commit_message>
Alvará evento 30/10: contato, segurança pública, horário da carreata e do bloqueio
Co-Authored-By: Claude Opus 5.5 <noreply@anthropic.com>
Claude-Session: https://claude.ai/code/session_01Xsu4psjqdzYnCKVsDP2B5y
</commit_message>
<xml_diff>
--- a/Alvará evento 30-10-2026 - Ronaldo de Lima Barbosa/Comunicação prévia à PM - evento 30-10-2026 - Ronaldo de Lima Barbosa.docx
+++ b/Alvará evento 30-10-2026 - Ronaldo de Lima Barbosa/Comunicação prévia à PM - evento 30-10-2026 - Ronaldo de Lima Barbosa.docx
@@ -185,29 +185,7 @@
         <w:t xml:space="preserve">Carreata:</w:t>
       </w:r>
       <w:r>
-        <w:t xml:space="preserve"> concentração às </w:t>
-      </w:r>
-      <w:r>
-        <w:rPr>
-          <w:b/>
-          <w:bCs/>
-          <w:shd w:fill="FFF200" w:color="auto" w:val="clear"/>
-        </w:rPr>
-        <w:t xml:space="preserve">[__h__]</w:t>
-      </w:r>
-      <w:r>
-        <w:t xml:space="preserve"> em </w:t>
-      </w:r>
-      <w:r>
-        <w:rPr>
-          <w:b/>
-          <w:bCs/>
-          <w:shd w:fill="FFF200" w:color="auto" w:val="clear"/>
-        </w:rPr>
-        <w:t xml:space="preserve">[local]</w:t>
-      </w:r>
-      <w:r>
-        <w:t xml:space="preserve">, percurso pelas vias públicas da cidade, a ser ajustado com esta Corporação, se necessário, e encerramento no local do evento;</w:t>
+        <w:t xml:space="preserve"> início às 17h00, percurso pelas vias públicas da cidade, a ser ajustado com esta Corporação, se necessário, e encerramento no local do evento;</w:t>
       </w:r>
     </w:p>
     <w:p>
@@ -253,18 +231,7 @@
         <w:t xml:space="preserve">Interdição de via requerida ao Município:</w:t>
       </w:r>
       <w:r>
-        <w:t xml:space="preserve"> Avenida Marcos Furtado, em frente ao estádio, das </w:t>
-      </w:r>
-      <w:r>
-        <w:rPr>
-          <w:b/>
-          <w:bCs/>
-          <w:shd w:fill="FFF200" w:color="auto" w:val="clear"/>
-        </w:rPr>
-        <w:t xml:space="preserve">[14h00]</w:t>
-      </w:r>
-      <w:r>
-        <w:t xml:space="preserve"> de 30/10 às </w:t>
+        <w:t xml:space="preserve"> Avenida Marcos Furtado, em frente ao estádio, das 16h30 de 30/10 às </w:t>
       </w:r>
       <w:r>
         <w:rPr>
@@ -295,21 +262,10 @@
           <w:b/>
           <w:bCs/>
         </w:rPr>
-        <w:t xml:space="preserve">Segurança privada / brigada:</w:t>
-      </w:r>
-      <w:r>
-        <w:t xml:space="preserve"> </w:t>
-      </w:r>
-      <w:r>
-        <w:rPr>
-          <w:b/>
-          <w:bCs/>
-          <w:shd w:fill="FFF200" w:color="auto" w:val="clear"/>
-        </w:rPr>
-        <w:t xml:space="preserve">[empresa ou equipe, nº de agentes]</w:t>
-      </w:r>
-      <w:r>
-        <w:t xml:space="preserve">;</w:t>
+        <w:t xml:space="preserve">Segurança:</w:t>
+      </w:r>
+      <w:r>
+        <w:t xml:space="preserve"> a cargo das forças de segurança pública, sem contratação de segurança privada;</w:t>
       </w:r>
     </w:p>
     <w:p>
@@ -332,18 +288,7 @@
         <w:t xml:space="preserve">Contato do responsável:</w:t>
       </w:r>
       <w:r>
-        <w:t xml:space="preserve"> </w:t>
-      </w:r>
-      <w:r>
-        <w:rPr>
-          <w:b/>
-          <w:bCs/>
-          <w:shd w:fill="FFF200" w:color="auto" w:val="clear"/>
-        </w:rPr>
-        <w:t xml:space="preserve">[telefone do Requerente]</w:t>
-      </w:r>
-      <w:r>
-        <w:t xml:space="preserve"> e (86) 9 7400-9869 (advogado).</w:t>
+        <w:t xml:space="preserve"> (86) 9 9977-5789 (Requerente) e (86) 9 7400-9869 (advogado).</w:t>
       </w:r>
     </w:p>
     <w:p>

</xml_diff>

<commit_message>
Alvará evento 30/10: inclui segurança privada contratada
Co-Authored-By: Claude Opus 5.5 <noreply@anthropic.com>
Claude-Session: https://claude.ai/code/session_01Xsu4psjqdzYnCKVsDP2B5y
</commit_message>
<xml_diff>
--- a/Alvará evento 30-10-2026 - Ronaldo de Lima Barbosa/Comunicação prévia à PM - evento 30-10-2026 - Ronaldo de Lima Barbosa.docx
+++ b/Alvará evento 30-10-2026 - Ronaldo de Lima Barbosa/Comunicação prévia à PM - evento 30-10-2026 - Ronaldo de Lima Barbosa.docx
@@ -265,7 +265,18 @@
         <w:t xml:space="preserve">Segurança:</w:t>
       </w:r>
       <w:r>
-        <w:t xml:space="preserve"> a cargo das forças de segurança pública, sem contratação de segurança privada;</w:t>
+        <w:t xml:space="preserve"> segurança privada contratada </w:t>
+      </w:r>
+      <w:r>
+        <w:rPr>
+          <w:b/>
+          <w:bCs/>
+          <w:shd w:fill="FFF200" w:color="auto" w:val="clear"/>
+        </w:rPr>
+        <w:t xml:space="preserve">[nome da empresa / nº de agentes]</w:t>
+      </w:r>
+      <w:r>
+        <w:t xml:space="preserve">, sem prejuízo do policiamento ostensivo ora solicitado;</w:t>
       </w:r>
     </w:p>
     <w:p>

</xml_diff>

<commit_message>
Alvará evento 30/10: incorpora edições do advogado, bloqueio da manhã até retirada do palco, juntada posterior da ART e via estadual
Co-Authored-By: Claude Opus 5.5 <noreply@anthropic.com>
Claude-Session: https://claude.ai/code/session_01Xsu4psjqdzYnCKVsDP2B5y
</commit_message>
<xml_diff>
--- a/Alvará evento 30-10-2026 - Ronaldo de Lima Barbosa/Comunicação prévia à PM - evento 30-10-2026 - Ronaldo de Lima Barbosa.docx
+++ b/Alvará evento 30-10-2026 - Ronaldo de Lima Barbosa/Comunicação prévia à PM - evento 30-10-2026 - Ronaldo de Lima Barbosa.docx
@@ -12,24 +12,7 @@
           <w:b/>
           <w:bCs/>
         </w:rPr>
-        <w:t xml:space="preserve">AO SENHOR COMANDANTE DO </w:t>
-      </w:r>
-      <w:r>
-        <w:rPr>
-          <w:b/>
-          <w:bCs/>
-          <w:b/>
-          <w:bCs/>
-          <w:shd w:fill="FFF200" w:color="auto" w:val="clear"/>
-        </w:rPr>
-        <w:t xml:space="preserve">[__º BATALHÃO / DESTACAMENTO]</w:t>
-      </w:r>
-      <w:r>
-        <w:rPr>
-          <w:b/>
-          <w:bCs/>
-        </w:rPr>
-        <w:t xml:space="preserve"> DA POLÍCIA MILITAR DO PIAUÍ EM MIGUEL ALVES-PI.</w:t>
+        <w:t xml:space="preserve">AO SENHOR COMANDANTE DA POLÍCIA MILITAR DO PIAUÍ EM MIGUEL ALVES-PI.</w:t>
       </w:r>
     </w:p>
     <w:p>
@@ -162,7 +145,18 @@
         <w:t xml:space="preserve">Local:</w:t>
       </w:r>
       <w:r>
-        <w:t xml:space="preserve"> Avenida Marcos Furtado, em frente ao Estádio Municipal Enéas Torres Filho (“O Torrão”), Miguel Alves-PI (Plus Code R493+M8), com palco, som e apresentação de banda;</w:t>
+        <w:t xml:space="preserve"> Avenida Marcos Furtado, trecho urbano da rodovia estadual PI-</w:t>
+      </w:r>
+      <w:r>
+        <w:rPr>
+          <w:b/>
+          <w:bCs/>
+          <w:shd w:fill="FFF200" w:color="auto" w:val="clear"/>
+        </w:rPr>
+        <w:t xml:space="preserve">[___]</w:t>
+      </w:r>
+      <w:r>
+        <w:t xml:space="preserve">, em frente ao Estádio Municipal Enéas Torres Filho (“O Torrão”), Miguel Alves-PI (Plus Code R493+M8), com palco, som e apresentação de bandas;</w:t>
       </w:r>
     </w:p>
     <w:p>
@@ -228,10 +222,10 @@
           <w:b/>
           <w:bCs/>
         </w:rPr>
-        <w:t xml:space="preserve">Interdição de via requerida ao Município:</w:t>
-      </w:r>
-      <w:r>
-        <w:t xml:space="preserve"> Avenida Marcos Furtado, em frente ao estádio, das 16h30 de 30/10 às </w:t>
+        <w:t xml:space="preserve">Interdição de via requerida ao Município e ao DER/PI:</w:t>
+      </w:r>
+      <w:r>
+        <w:t xml:space="preserve"> Avenida Marcos Furtado (PI-</w:t>
       </w:r>
       <w:r>
         <w:rPr>
@@ -239,10 +233,21 @@
           <w:bCs/>
           <w:shd w:fill="FFF200" w:color="auto" w:val="clear"/>
         </w:rPr>
-        <w:t xml:space="preserve">[06h00]</w:t>
-      </w:r>
-      <w:r>
-        <w:t xml:space="preserve"> de 31/10/2026;</w:t>
+        <w:t xml:space="preserve">[___]</w:t>
+      </w:r>
+      <w:r>
+        <w:t xml:space="preserve">), em frente ao estádio, das </w:t>
+      </w:r>
+      <w:r>
+        <w:rPr>
+          <w:b/>
+          <w:bCs/>
+          <w:shd w:fill="FFF200" w:color="auto" w:val="clear"/>
+        </w:rPr>
+        <w:t xml:space="preserve">[07h00]</w:t>
+      </w:r>
+      <w:r>
+        <w:t xml:space="preserve"> de 30/10 até a retirada do palco, às 14h00 de 31/10/2026;</w:t>
       </w:r>
     </w:p>
     <w:p>
@@ -265,18 +270,7 @@
         <w:t xml:space="preserve">Segurança:</w:t>
       </w:r>
       <w:r>
-        <w:t xml:space="preserve"> segurança privada contratada </w:t>
-      </w:r>
-      <w:r>
-        <w:rPr>
-          <w:b/>
-          <w:bCs/>
-          <w:shd w:fill="FFF200" w:color="auto" w:val="clear"/>
-        </w:rPr>
-        <w:t xml:space="preserve">[nome da empresa / nº de agentes]</w:t>
-      </w:r>
-      <w:r>
-        <w:t xml:space="preserve">, sem prejuízo do policiamento ostensivo ora solicitado;</w:t>
+        <w:t xml:space="preserve"> segurança privada contratada, sem prejuízo do policiamento ostensivo ora solicitado;</w:t>
       </w:r>
     </w:p>
     <w:p>

</xml_diff>